<commit_message>
fix: rename employer BaylorTech -> VJ Tech Solutions in resume PDF + DOCX
</commit_message>
<xml_diff>
--- a/resume/Adeeb_Ansar_Syed_Resume.docx
+++ b/resume/Adeeb_Ansar_Syed_Resume.docx
@@ -25,7 +25,7 @@
           <w:color w:val="444444"/>
           <w:sz w:val="23"/>
         </w:rPr>
-        <w:t>Data &amp; AI Governance  ·  Data Quality  ·  Operations</w:t>
+        <w:t>Data &amp; AI Governance · Data Quality · Operations</w:t>
       </w:r>
     </w:p>
     <w:p>
@@ -37,7 +37,7 @@
           <w:color w:val="444444"/>
           <w:sz w:val="19"/>
         </w:rPr>
-        <w:t>Chicago, IL (open to relocation, U.S.)  ·  774-253-7469  ·  ady.states@gmail.com</w:t>
+        <w:t>Chicago, IL (open to relocation, U.S.) · 774-253-7469 · ady.states@gmail.com</w:t>
       </w:r>
     </w:p>
     <w:p>
@@ -258,7 +258,7 @@
           <w:color w:val="444444"/>
           <w:sz w:val="19"/>
         </w:rPr>
-        <w:t xml:space="preserve">   BaylorTech LLC, Remote, USA  ·  08/2024 – 10/2025</w:t>
+        <w:t xml:space="preserve">   VJ Tech Solutions, Remote, USA  ·  08/2024 – 10/2025</w:t>
       </w:r>
     </w:p>
     <w:p>

</xml_diff>

<commit_message>
resume: align VJ Tech to I-983 (Business Analyst, requirements/data-analysis framing)
</commit_message>
<xml_diff>
--- a/resume/Adeeb_Ansar_Syed_Resume.docx
+++ b/resume/Adeeb_Ansar_Syed_Resume.docx
@@ -251,7 +251,7 @@
           <w:color w:val="1A1A1A"/>
           <w:sz w:val="22"/>
         </w:rPr>
-        <w:t>IT Operations Analyst</w:t>
+        <w:t>Business Analyst</w:t>
       </w:r>
       <w:r>
         <w:rPr>
@@ -272,7 +272,7 @@
           <w:color w:val="1A1A1A"/>
           <w:sz w:val="21"/>
         </w:rPr>
-        <w:t>Improved reporting accuracy by 30% by building Power BI and Tableau dashboards for SLOs, MTTR, change success, and operational KPIs — establishing trusted, governed reporting for leadership decisions.</w:t>
+        <w:t>Gathered business and reporting requirements and rebuilt Power BI and Tableau reporting into governed, trusted dashboards — improving reporting accuracy by 30% for leadership decisions.</w:t>
       </w:r>
     </w:p>
     <w:p>
@@ -286,7 +286,7 @@
           <w:color w:val="1A1A1A"/>
           <w:sz w:val="21"/>
         </w:rPr>
-        <w:t>Reduced incident resolution time by 25% through automated monitoring and optimized escalation workflows.</w:t>
+        <w:t>Standardized data definitions and functional documentation and partnered with technical teams on data-driven process improvements that reduced resolution and turnaround time by 25%.</w:t>
       </w:r>
     </w:p>
     <w:p>
@@ -300,7 +300,7 @@
           <w:color w:val="1A1A1A"/>
           <w:sz w:val="21"/>
         </w:rPr>
-        <w:t>Increased deployment success by 18% via change governance: risk classification, automated pre-deployment checks, and structured post-implementation reviews.</w:t>
+        <w:t>Analyzed change and deployment workflows and introduced requirement and pre-implementation checks that increased deployment success by 18%.</w:t>
       </w:r>
     </w:p>
     <w:p>
@@ -314,7 +314,7 @@
           <w:color w:val="1A1A1A"/>
           <w:sz w:val="21"/>
         </w:rPr>
-        <w:t>Translated service-performance gaps into reporting requirements, dashboard logic, and data-quality and process improvements.</w:t>
+        <w:t>Translated operational pain points into clear requirements, data-quality rules, and process optimizations across business and technical teams.</w:t>
       </w:r>
     </w:p>
     <w:p>

</xml_diff>

<commit_message>
feat: add Microsoft & LinkedIn Generative AI cert (resume + portfolio Certifications section)
</commit_message>
<xml_diff>
--- a/resume/Adeeb_Ansar_Syed_Resume.docx
+++ b/resume/Adeeb_Ansar_Syed_Resume.docx
@@ -961,6 +961,20 @@
           <w:color w:val="1A1A1A"/>
           <w:sz w:val="21"/>
         </w:rPr>
+        <w:t>Career Essentials in Generative AI — Microsoft &amp; LinkedIn (in progress)</w:t>
+      </w:r>
+    </w:p>
+    <w:p>
+      <w:pPr>
+        <w:pStyle w:val="ListBullet"/>
+        <w:spacing w:after="40" w:line="252" w:lineRule="auto"/>
+      </w:pPr>
+      <w:r>
+        <w:rPr>
+          <w:b w:val="0"/>
+          <w:color w:val="1A1A1A"/>
+          <w:sz w:val="21"/>
+        </w:rPr>
         <w:t>Introduction to AI for Work — DataCamp, 2026</w:t>
       </w:r>
     </w:p>

</xml_diff>

<commit_message>
resume: add release/deployment governance skills + CI/CD self-study (conceptual, interview-safe)
</commit_message>
<xml_diff>
--- a/resume/Adeeb_Ansar_Syed_Resume.docx
+++ b/resume/Adeeb_Ansar_Syed_Resume.docx
@@ -200,7 +200,7 @@
           <w:color w:val="1A1A1A"/>
           <w:sz w:val="21"/>
         </w:rPr>
-        <w:t>ITIL, incident / change / problem management, process improvement, process mapping, root-cause analysis, SLA / SLO / MTTR, service delivery</w:t>
+        <w:t>ITIL, incident / change / release / deployment management, deployment &amp; release governance, process improvement, process mapping, root-cause analysis, SLA / SLO / MTTR, service delivery</w:t>
       </w:r>
     </w:p>
     <w:p>
@@ -978,6 +978,20 @@
         <w:t>Introduction to AI for Work — DataCamp, 2026</w:t>
       </w:r>
     </w:p>
+    <w:p>
+      <w:pPr>
+        <w:pStyle w:val="ListBullet"/>
+        <w:spacing w:after="40" w:line="252" w:lineRule="auto"/>
+      </w:pPr>
+      <w:r>
+        <w:rPr>
+          <w:b w:val="0"/>
+          <w:color w:val="1A1A1A"/>
+          <w:sz w:val="21"/>
+        </w:rPr>
+        <w:t>CI/CD &amp; release-engineering fundamentals — self-study</w:t>
+      </w:r>
+    </w:p>
     <w:sectPr>
       <w:pgSz w:w="12240" w:h="15840"/>
       <w:pgMar w:top="864" w:right="1008" w:bottom="864" w:left="1008" w:header="720" w:footer="720" w:gutter="0"/>

</xml_diff>

<commit_message>
fix: drop CI/CD self-study + 'in progress' from certs; tighten hero pill copy; regenerate served resume PDF/DOCX from corrected data
</commit_message>
<xml_diff>
--- a/resume/Adeeb_Ansar_Syed_Resume.docx
+++ b/resume/Adeeb_Ansar_Syed_Resume.docx
@@ -961,7 +961,7 @@
           <w:color w:val="1A1A1A"/>
           <w:sz w:val="21"/>
         </w:rPr>
-        <w:t>Career Essentials in Generative AI — Microsoft &amp; LinkedIn (in progress)</w:t>
+        <w:t>Career Essentials in Generative AI — Microsoft &amp; LinkedIn</w:t>
       </w:r>
     </w:p>
     <w:p>
@@ -976,20 +976,6 @@
           <w:sz w:val="21"/>
         </w:rPr>
         <w:t>Introduction to AI for Work — DataCamp, 2026</w:t>
-      </w:r>
-    </w:p>
-    <w:p>
-      <w:pPr>
-        <w:pStyle w:val="ListBullet"/>
-        <w:spacing w:after="40" w:line="252" w:lineRule="auto"/>
-      </w:pPr>
-      <w:r>
-        <w:rPr>
-          <w:b w:val="0"/>
-          <w:color w:val="1A1A1A"/>
-          <w:sz w:val="21"/>
-        </w:rPr>
-        <w:t>CI/CD &amp; release-engineering fundamentals — self-study</w:t>
       </w:r>
     </w:p>
     <w:sectPr>

</xml_diff>